<commit_message>
chore: update invite letter
</commit_message>
<xml_diff>
--- a/misc/2026/Carta Convite - Copa São Bernardo de Badminton 2026.docx
+++ b/misc/2026/Carta Convite - Copa São Bernardo de Badminton 2026.docx
@@ -1522,6 +1522,7 @@
     <w:p>
       <w:pPr>
         <w:numPr>
+          <w:ilvl w:val="0"/>
           <w:numId w:val="0"/>
         </w:numPr>
         <w:spacing w:line="360" w:lineRule="auto"/>
@@ -1540,6 +1541,7 @@
     <w:p>
       <w:pPr>
         <w:numPr>
+          <w:ilvl w:val="0"/>
           <w:numId w:val="0"/>
         </w:numPr>
         <w:spacing w:line="360" w:lineRule="auto"/>
@@ -1680,7 +1682,74 @@
           <w:szCs w:val="24"/>
           <w:lang w:val="pt-BR"/>
         </w:rPr>
-        <w:t>O comprovante de pagamento</w:t>
+        <w:t xml:space="preserve">O comprovante de pagamento deverá ser enviado para </w:t>
+      </w:r>
+      <w:r>
+        <w:rPr>
+          <w:rFonts w:hint="default" w:ascii="Arial" w:hAnsi="Arial"/>
+          <w:b w:val="0"/>
+          <w:bCs w:val="0"/>
+          <w:sz w:val="24"/>
+          <w:szCs w:val="24"/>
+          <w:lang w:val="pt-BR"/>
+        </w:rPr>
+        <w:fldChar w:fldCharType="begin"/>
+      </w:r>
+      <w:r>
+        <w:rPr>
+          <w:rFonts w:hint="default" w:ascii="Arial" w:hAnsi="Arial"/>
+          <w:b w:val="0"/>
+          <w:bCs w:val="0"/>
+          <w:sz w:val="24"/>
+          <w:szCs w:val="24"/>
+          <w:lang w:val="pt-BR"/>
+        </w:rPr>
+        <w:instrText xml:space="preserve"> HYPERLINK "mailto:sbb@terra.com.br" </w:instrText>
+      </w:r>
+      <w:r>
+        <w:rPr>
+          <w:rFonts w:hint="default" w:ascii="Arial" w:hAnsi="Arial"/>
+          <w:b w:val="0"/>
+          <w:bCs w:val="0"/>
+          <w:sz w:val="24"/>
+          <w:szCs w:val="24"/>
+          <w:lang w:val="pt-BR"/>
+        </w:rPr>
+        <w:fldChar w:fldCharType="separate"/>
+      </w:r>
+      <w:r>
+        <w:rPr>
+          <w:rStyle w:val="8"/>
+          <w:rFonts w:hint="default" w:ascii="Arial" w:hAnsi="Arial"/>
+          <w:b w:val="0"/>
+          <w:bCs w:val="0"/>
+          <w:sz w:val="24"/>
+          <w:szCs w:val="24"/>
+          <w:lang w:val="pt-BR"/>
+        </w:rPr>
+        <w:t>sbb@terra.com.br</w:t>
+      </w:r>
+      <w:r>
+        <w:rPr>
+          <w:rFonts w:hint="default" w:ascii="Arial" w:hAnsi="Arial"/>
+          <w:b w:val="0"/>
+          <w:bCs w:val="0"/>
+          <w:sz w:val="24"/>
+          <w:szCs w:val="24"/>
+          <w:lang w:val="pt-BR"/>
+        </w:rPr>
+        <w:fldChar w:fldCharType="end"/>
+      </w:r>
+      <w:r>
+        <w:rPr>
+          <w:rFonts w:hint="default" w:ascii="Arial" w:hAnsi="Arial"/>
+          <w:b w:val="0"/>
+          <w:bCs w:val="0"/>
+          <w:sz w:val="24"/>
+          <w:szCs w:val="24"/>
+          <w:lang w:val="pt-BR"/>
+        </w:rPr>
+        <w:t xml:space="preserve"> até o dia 19</w:t>
       </w:r>
       <w:bookmarkStart w:id="0" w:name="_GoBack"/>
       <w:bookmarkEnd w:id="0"/>
@@ -1693,74 +1762,7 @@
           <w:szCs w:val="24"/>
           <w:lang w:val="pt-BR"/>
         </w:rPr>
-        <w:t xml:space="preserve"> deverá ser enviado para </w:t>
-      </w:r>
-      <w:r>
-        <w:rPr>
-          <w:rFonts w:hint="default" w:ascii="Arial" w:hAnsi="Arial"/>
-          <w:b w:val="0"/>
-          <w:bCs w:val="0"/>
-          <w:sz w:val="24"/>
-          <w:szCs w:val="24"/>
-          <w:lang w:val="pt-BR"/>
-        </w:rPr>
-        <w:fldChar w:fldCharType="begin"/>
-      </w:r>
-      <w:r>
-        <w:rPr>
-          <w:rFonts w:hint="default" w:ascii="Arial" w:hAnsi="Arial"/>
-          <w:b w:val="0"/>
-          <w:bCs w:val="0"/>
-          <w:sz w:val="24"/>
-          <w:szCs w:val="24"/>
-          <w:lang w:val="pt-BR"/>
-        </w:rPr>
-        <w:instrText xml:space="preserve"> HYPERLINK "mailto:sbb@terra.com.br" </w:instrText>
-      </w:r>
-      <w:r>
-        <w:rPr>
-          <w:rFonts w:hint="default" w:ascii="Arial" w:hAnsi="Arial"/>
-          <w:b w:val="0"/>
-          <w:bCs w:val="0"/>
-          <w:sz w:val="24"/>
-          <w:szCs w:val="24"/>
-          <w:lang w:val="pt-BR"/>
-        </w:rPr>
-        <w:fldChar w:fldCharType="separate"/>
-      </w:r>
-      <w:r>
-        <w:rPr>
-          <w:rStyle w:val="8"/>
-          <w:rFonts w:hint="default" w:ascii="Arial" w:hAnsi="Arial"/>
-          <w:b w:val="0"/>
-          <w:bCs w:val="0"/>
-          <w:sz w:val="24"/>
-          <w:szCs w:val="24"/>
-          <w:lang w:val="pt-BR"/>
-        </w:rPr>
-        <w:t>sbb@terra.com.br</w:t>
-      </w:r>
-      <w:r>
-        <w:rPr>
-          <w:rFonts w:hint="default" w:ascii="Arial" w:hAnsi="Arial"/>
-          <w:b w:val="0"/>
-          <w:bCs w:val="0"/>
-          <w:sz w:val="24"/>
-          <w:szCs w:val="24"/>
-          <w:lang w:val="pt-BR"/>
-        </w:rPr>
-        <w:fldChar w:fldCharType="end"/>
-      </w:r>
-      <w:r>
-        <w:rPr>
-          <w:rFonts w:hint="default" w:ascii="Arial" w:hAnsi="Arial"/>
-          <w:b w:val="0"/>
-          <w:bCs w:val="0"/>
-          <w:sz w:val="24"/>
-          <w:szCs w:val="24"/>
-          <w:lang w:val="pt-BR"/>
-        </w:rPr>
-        <w:t xml:space="preserve"> até o dia 12 de setembro de 2026. </w:t>
+        <w:t xml:space="preserve"> de setembro de 2026. </w:t>
       </w:r>
       <w:r>
         <w:rPr>
@@ -2116,7 +2118,7 @@
           <w:szCs w:val="24"/>
           <w:lang w:val="pt-BR"/>
         </w:rPr>
-        <w:t>Prazo para inscrições: 12 de setembro de 2026</w:t>
+        <w:t>Prazo para inscrições: 19 de setembro de 2026</w:t>
       </w:r>
     </w:p>
     <w:p>
@@ -2957,7 +2959,7 @@
     <w:lsdException w:unhideWhenUsed="0" w:uiPriority="0" w:semiHidden="0" w:name="Normal Indent"/>
     <w:lsdException w:unhideWhenUsed="0" w:uiPriority="0" w:semiHidden="0" w:name="footnote text"/>
     <w:lsdException w:unhideWhenUsed="0" w:uiPriority="0" w:semiHidden="0" w:name="annotation text"/>
-    <w:lsdException w:unhideWhenUsed="0" w:uiPriority="0" w:semiHidden="0" w:name="header"/>
+    <w:lsdException w:qFormat="1" w:unhideWhenUsed="0" w:uiPriority="0" w:semiHidden="0" w:name="header"/>
     <w:lsdException w:qFormat="1" w:unhideWhenUsed="0" w:uiPriority="0" w:semiHidden="0" w:name="footer"/>
     <w:lsdException w:unhideWhenUsed="0" w:uiPriority="0" w:semiHidden="0" w:name="index heading"/>
     <w:lsdException w:qFormat="1" w:uiPriority="0" w:name="caption"/>
@@ -3011,7 +3013,7 @@
     <w:lsdException w:unhideWhenUsed="0" w:uiPriority="0" w:semiHidden="0" w:name="Body Text Indent 2"/>
     <w:lsdException w:unhideWhenUsed="0" w:uiPriority="0" w:semiHidden="0" w:name="Body Text Indent 3"/>
     <w:lsdException w:unhideWhenUsed="0" w:uiPriority="0" w:semiHidden="0" w:name="Block Text"/>
-    <w:lsdException w:unhideWhenUsed="0" w:uiPriority="0" w:semiHidden="0" w:name="Hyperlink"/>
+    <w:lsdException w:qFormat="1" w:unhideWhenUsed="0" w:uiPriority="0" w:semiHidden="0" w:name="Hyperlink"/>
     <w:lsdException w:unhideWhenUsed="0" w:uiPriority="0" w:semiHidden="0" w:name="FollowedHyperlink"/>
     <w:lsdException w:qFormat="1" w:unhideWhenUsed="0" w:uiPriority="0" w:semiHidden="0" w:name="Strong"/>
     <w:lsdException w:qFormat="1" w:unhideWhenUsed="0" w:uiPriority="0" w:semiHidden="0" w:name="Emphasis"/>
@@ -3179,6 +3181,7 @@
   <w:style w:type="character" w:styleId="8">
     <w:name w:val="Hyperlink"/>
     <w:basedOn w:val="6"/>
+    <w:qFormat/>
     <w:uiPriority w:val="0"/>
     <w:rPr>
       <w:color w:val="0000FF"/>
@@ -3188,6 +3191,7 @@
   <w:style w:type="paragraph" w:styleId="9">
     <w:name w:val="header"/>
     <w:basedOn w:val="1"/>
+    <w:qFormat/>
     <w:uiPriority w:val="0"/>
     <w:pPr>
       <w:tabs>

</xml_diff>